<commit_message>
atualização do arquivo termo_modelo_celular
</commit_message>
<xml_diff>
--- a/TERMO_RESPONSABILIDADE_CELULAR_MODELO.docx
+++ b/TERMO_RESPONSABILIDADE_CELULAR_MODELO.docx
@@ -1,6 +1,6 @@
 
 <file path=word/document.xml><?xml version="1.0" encoding="utf-8"?>
-<w:document xmlns:wpc="http://schemas.microsoft.com/office/word/2010/wordprocessingCanvas" xmlns:cx="http://schemas.microsoft.com/office/drawing/2014/chartex" xmlns:cx1="http://schemas.microsoft.com/office/drawing/2015/9/8/chartex" xmlns:cx2="http://schemas.microsoft.com/office/drawing/2015/10/21/chartex" xmlns:cx3="http://schemas.microsoft.com/office/drawing/2016/5/9/chartex" xmlns:cx4="http://schemas.microsoft.com/office/drawing/2016/5/10/chartex" xmlns:cx5="http://schemas.microsoft.com/office/drawing/2016/5/11/chartex" xmlns:cx6="http://schemas.microsoft.com/office/drawing/2016/5/12/chartex" xmlns:cx7="http://schemas.microsoft.com/office/drawing/2016/5/13/chartex" xmlns:cx8="http://schemas.microsoft.com/office/drawing/2016/5/14/chartex" xmlns:mc="http://schemas.openxmlformats.org/markup-compatibility/2006" xmlns:aink="http://schemas.microsoft.com/office/drawing/2016/ink" xmlns:am3d="http://schemas.microsoft.com/office/drawing/2017/model3d" xmlns:o="urn:schemas-microsoft-com:office:office" xmlns:oel="http://schemas.microsoft.com/office/2019/extlst" xmlns:r="http://schemas.openxmlformats.org/officeDocument/2006/relationships" xmlns:m="http://schemas.openxmlformats.org/officeDocument/2006/math" xmlns:v="urn:schemas-microsoft-com:vml" xmlns:wp14="http://schemas.microsoft.com/office/word/2010/wordprocessingDrawing" xmlns:wp="http://schemas.openxmlformats.org/drawingml/2006/wordprocessingDrawing" xmlns:w10="urn:schemas-microsoft-com:office:word" xmlns:w="http://schemas.openxmlformats.org/wordprocessingml/2006/main" xmlns:w14="http://schemas.microsoft.com/office/word/2010/wordml" xmlns:w15="http://schemas.microsoft.com/office/word/2012/wordml" xmlns:w16cex="http://schemas.microsoft.com/office/word/2018/wordml/cex" xmlns:w16cid="http://schemas.microsoft.com/office/word/2016/wordml/cid" xmlns:w16="http://schemas.microsoft.com/office/word/2018/wordml" xmlns:w16sdtdh="http://schemas.microsoft.com/office/word/2020/wordml/sdtdatahash" xmlns:w16se="http://schemas.microsoft.com/office/word/2015/wordml/symex" xmlns:wpg="http://schemas.microsoft.com/office/word/2010/wordprocessingGroup" xmlns:wpi="http://schemas.microsoft.com/office/word/2010/wordprocessingInk" xmlns:wne="http://schemas.microsoft.com/office/word/2006/wordml" xmlns:wps="http://schemas.microsoft.com/office/word/2010/wordprocessingShape" mc:Ignorable="w14 w15 w16se w16cid w16 w16cex w16sdtdh wp14">
+<w:document xmlns:wpc="http://schemas.microsoft.com/office/word/2010/wordprocessingCanvas" xmlns:cx="http://schemas.microsoft.com/office/drawing/2014/chartex" xmlns:cx1="http://schemas.microsoft.com/office/drawing/2015/9/8/chartex" xmlns:cx2="http://schemas.microsoft.com/office/drawing/2015/10/21/chartex" xmlns:cx3="http://schemas.microsoft.com/office/drawing/2016/5/9/chartex" xmlns:cx4="http://schemas.microsoft.com/office/drawing/2016/5/10/chartex" xmlns:cx5="http://schemas.microsoft.com/office/drawing/2016/5/11/chartex" xmlns:cx6="http://schemas.microsoft.com/office/drawing/2016/5/12/chartex" xmlns:cx7="http://schemas.microsoft.com/office/drawing/2016/5/13/chartex" xmlns:cx8="http://schemas.microsoft.com/office/drawing/2016/5/14/chartex" xmlns:mc="http://schemas.openxmlformats.org/markup-compatibility/2006" xmlns:aink="http://schemas.microsoft.com/office/drawing/2016/ink" xmlns:am3d="http://schemas.microsoft.com/office/drawing/2017/model3d" xmlns:o="urn:schemas-microsoft-com:office:office" xmlns:oel="http://schemas.microsoft.com/office/2019/extlst" xmlns:r="http://schemas.openxmlformats.org/officeDocument/2006/relationships" xmlns:m="http://schemas.openxmlformats.org/officeDocument/2006/math" xmlns:v="urn:schemas-microsoft-com:vml" xmlns:wp14="http://schemas.microsoft.com/office/word/2010/wordprocessingDrawing" xmlns:wp="http://schemas.openxmlformats.org/drawingml/2006/wordprocessingDrawing" xmlns:w10="urn:schemas-microsoft-com:office:word" xmlns:w="http://schemas.openxmlformats.org/wordprocessingml/2006/main" xmlns:w14="http://schemas.microsoft.com/office/word/2010/wordml" xmlns:w15="http://schemas.microsoft.com/office/word/2012/wordml" xmlns:w16cex="http://schemas.microsoft.com/office/word/2018/wordml/cex" xmlns:w16cid="http://schemas.microsoft.com/office/word/2016/wordml/cid" xmlns:w16="http://schemas.microsoft.com/office/word/2018/wordml" xmlns:w16du="http://schemas.microsoft.com/office/word/2023/wordml/word16du" xmlns:w16sdtdh="http://schemas.microsoft.com/office/word/2020/wordml/sdtdatahash" xmlns:w16sdtfl="http://schemas.microsoft.com/office/word/2024/wordml/sdtformatlock" xmlns:w16se="http://schemas.microsoft.com/office/word/2015/wordml/symex" xmlns:wpg="http://schemas.microsoft.com/office/word/2010/wordprocessingGroup" xmlns:wpi="http://schemas.microsoft.com/office/word/2010/wordprocessingInk" xmlns:wne="http://schemas.microsoft.com/office/word/2006/wordml" xmlns:wps="http://schemas.microsoft.com/office/word/2010/wordprocessingShape" mc:Ignorable="w14 w15 w16se w16cid w16 w16cex w16sdtdh w16sdtfl w16du wp14">
   <w:body>
     <w:p>
       <w:pPr>
@@ -297,14 +297,6 @@
           <w:b/>
           <w:bCs/>
         </w:rPr>
-        <w:t/>
-      </w:r>
-      <w:r>
-        <w:rPr>
-          <w:rFonts w:ascii="Calibri" w:hAnsi="Calibri" w:cs="Calibri"/>
-          <w:b/>
-          <w:bCs/>
-        </w:rPr>
         <w:t xml:space="preserve"> </w:t>
       </w:r>
       <w:r>
@@ -320,6 +312,39 @@
       <w:pPr>
         <w:rPr>
           <w:rFonts w:ascii="Calibri" w:hAnsi="Calibri" w:cs="Calibri"/>
+          <w:b/>
+          <w:bCs/>
+        </w:rPr>
+      </w:pPr>
+      <w:r>
+        <w:rPr>
+          <w:rFonts w:ascii="Calibri" w:hAnsi="Calibri" w:cs="Calibri"/>
+          <w:b/>
+          <w:bCs/>
+        </w:rPr>
+        <w:t>IMEI2:</w:t>
+      </w:r>
+      <w:r>
+        <w:rPr>
+          <w:rFonts w:ascii="Calibri" w:hAnsi="Calibri" w:cs="Calibri"/>
+          <w:b/>
+          <w:bCs/>
+        </w:rPr>
+        <w:t xml:space="preserve"> </w:t>
+      </w:r>
+      <w:r>
+        <w:rPr>
+          <w:rFonts w:ascii="Calibri" w:hAnsi="Calibri" w:cs="Calibri"/>
+          <w:b/>
+          <w:bCs/>
+        </w:rPr>
+        <w:t xml:space="preserve"> {{ imei_2 }}</w:t>
+      </w:r>
+    </w:p>
+    <w:p>
+      <w:pPr>
+        <w:rPr>
+          <w:rFonts w:ascii="Calibri" w:hAnsi="Calibri" w:cs="Calibri"/>
         </w:rPr>
       </w:pPr>
       <w:r>
@@ -329,137 +354,6 @@
           <w:bCs/>
         </w:rPr>
         <w:t>Número: {{ numero_celular }}</w:t>
-      </w:r>
-      <w:r>
-        <w:rPr>
-          <w:rFonts w:ascii="Calibri" w:hAnsi="Calibri" w:cs="Calibri"/>
-          <w:b/>
-          <w:bCs/>
-        </w:rPr>
-        <w:t/>
-      </w:r>
-      <w:r>
-        <w:rPr>
-          <w:rFonts w:ascii="Calibri" w:hAnsi="Calibri" w:cs="Calibri"/>
-          <w:b/>
-          <w:bCs/>
-        </w:rPr>
-        <w:t/>
-      </w:r>
-      <w:r>
-        <w:rPr>
-          <w:rFonts w:ascii="Calibri" w:hAnsi="Calibri" w:cs="Calibri"/>
-          <w:b/>
-          <w:bCs/>
-        </w:rPr>
-        <w:t/>
-      </w:r>
-      <w:r>
-        <w:rPr>
-          <w:rFonts w:ascii="Calibri" w:hAnsi="Calibri" w:cs="Calibri"/>
-          <w:b/>
-          <w:bCs/>
-        </w:rPr>
-        <w:t xml:space="preserve"/>
-      </w:r>
-      <w:r>
-        <w:rPr>
-          <w:rFonts w:ascii="Calibri" w:hAnsi="Calibri" w:cs="Calibri"/>
-          <w:b/>
-          <w:bCs/>
-        </w:rPr>
-        <w:t xml:space="preserve"/>
-      </w:r>
-      <w:r>
-        <w:rPr>
-          <w:rFonts w:ascii="Calibri" w:hAnsi="Calibri" w:cs="Calibri"/>
-          <w:color w:val="242424"/>
-          <w:sz w:val="22"/>
-          <w:szCs w:val="22"/>
-          <w:shd w:val="clear" w:color="auto" w:fill="FFFFFF"/>
-        </w:rPr>
-        <w:br/>
-      </w:r>
-      <w:r>
-        <w:rPr>
-          <w:rFonts w:ascii="Calibri" w:hAnsi="Calibri" w:cs="Calibri"/>
-          <w:b/>
-          <w:bCs/>
-        </w:rPr>
-        <w:t/>
-      </w:r>
-      <w:r>
-        <w:rPr>
-          <w:rFonts w:ascii="Calibri" w:hAnsi="Calibri" w:cs="Calibri"/>
-        </w:rPr>
-        <w:t/>
-      </w:r>
-      <w:r>
-        <w:rPr>
-          <w:rFonts w:ascii="Calibri" w:hAnsi="Calibri" w:cs="Calibri"/>
-        </w:rPr>
-        <w:t xml:space="preserve"/>
-      </w:r>
-      <w:r>
-        <w:rPr>
-          <w:rFonts w:ascii="Calibri" w:hAnsi="Calibri" w:cs="Calibri"/>
-        </w:rPr>
-        <w:t/>
-      </w:r>
-    </w:p>
-    <w:p>
-      <w:pPr>
-        <w:rPr>
-          <w:rFonts w:ascii="Calibri" w:hAnsi="Calibri" w:cs="Calibri"/>
-        </w:rPr>
-      </w:pPr>
-      <w:r>
-        <w:rPr>
-          <w:rFonts w:ascii="Calibri" w:hAnsi="Calibri" w:cs="Calibri"/>
-          <w:b/>
-          <w:bCs/>
-        </w:rPr>
-        <w:t>IMEI2:</w:t>
-      </w:r>
-      <w:r>
-        <w:rPr>
-          <w:rFonts w:ascii="Calibri" w:hAnsi="Calibri" w:cs="Calibri"/>
-          <w:b/>
-          <w:bCs/>
-        </w:rPr>
-        <w:t/>
-      </w:r>
-      <w:r>
-        <w:rPr>
-          <w:rFonts w:ascii="Calibri" w:hAnsi="Calibri" w:cs="Calibri"/>
-          <w:b/>
-          <w:bCs/>
-        </w:rPr>
-        <w:t/>
-      </w:r>
-      <w:r>
-        <w:rPr>
-          <w:rFonts w:ascii="Calibri" w:hAnsi="Calibri" w:cs="Calibri"/>
-          <w:b/>
-          <w:bCs/>
-        </w:rPr>
-        <w:t/>
-      </w:r>
-      <w:r>
-        <w:rPr>
-          <w:rFonts w:ascii="Calibri" w:hAnsi="Calibri" w:cs="Calibri"/>
-          <w:b/>
-          <w:bCs/>
-        </w:rPr>
-        <w:t xml:space="preserve"> </w:t>
-      </w:r>
-      <w:r>
-        <w:rPr>
-          <w:rFonts w:ascii="Calibri" w:hAnsi="Calibri" w:cs="Calibri"/>
-          <w:b/>
-          <w:bCs/>
-        </w:rPr>
-        <w:t xml:space="preserve"> {{ imei_2 }}</w:t>
       </w:r>
       <w:r>
         <w:rPr>
@@ -1213,7 +1107,7 @@
 </file>
 
 <file path=word/endnotes.xml><?xml version="1.0" encoding="utf-8"?>
-<w:endnotes xmlns:wpc="http://schemas.microsoft.com/office/word/2010/wordprocessingCanvas" xmlns:cx="http://schemas.microsoft.com/office/drawing/2014/chartex" xmlns:cx1="http://schemas.microsoft.com/office/drawing/2015/9/8/chartex" xmlns:cx2="http://schemas.microsoft.com/office/drawing/2015/10/21/chartex" xmlns:cx3="http://schemas.microsoft.com/office/drawing/2016/5/9/chartex" xmlns:cx4="http://schemas.microsoft.com/office/drawing/2016/5/10/chartex" xmlns:cx5="http://schemas.microsoft.com/office/drawing/2016/5/11/chartex" xmlns:cx6="http://schemas.microsoft.com/office/drawing/2016/5/12/chartex" xmlns:cx7="http://schemas.microsoft.com/office/drawing/2016/5/13/chartex" xmlns:cx8="http://schemas.microsoft.com/office/drawing/2016/5/14/chartex" xmlns:mc="http://schemas.openxmlformats.org/markup-compatibility/2006" xmlns:aink="http://schemas.microsoft.com/office/drawing/2016/ink" xmlns:am3d="http://schemas.microsoft.com/office/drawing/2017/model3d" xmlns:o="urn:schemas-microsoft-com:office:office" xmlns:oel="http://schemas.microsoft.com/office/2019/extlst" xmlns:r="http://schemas.openxmlformats.org/officeDocument/2006/relationships" xmlns:m="http://schemas.openxmlformats.org/officeDocument/2006/math" xmlns:v="urn:schemas-microsoft-com:vml" xmlns:wp14="http://schemas.microsoft.com/office/word/2010/wordprocessingDrawing" xmlns:wp="http://schemas.openxmlformats.org/drawingml/2006/wordprocessingDrawing" xmlns:w10="urn:schemas-microsoft-com:office:word" xmlns:w="http://schemas.openxmlformats.org/wordprocessingml/2006/main" xmlns:w14="http://schemas.microsoft.com/office/word/2010/wordml" xmlns:w15="http://schemas.microsoft.com/office/word/2012/wordml" xmlns:w16cex="http://schemas.microsoft.com/office/word/2018/wordml/cex" xmlns:w16cid="http://schemas.microsoft.com/office/word/2016/wordml/cid" xmlns:w16="http://schemas.microsoft.com/office/word/2018/wordml" xmlns:w16sdtdh="http://schemas.microsoft.com/office/word/2020/wordml/sdtdatahash" xmlns:w16se="http://schemas.microsoft.com/office/word/2015/wordml/symex" xmlns:wpg="http://schemas.microsoft.com/office/word/2010/wordprocessingGroup" xmlns:wpi="http://schemas.microsoft.com/office/word/2010/wordprocessingInk" xmlns:wne="http://schemas.microsoft.com/office/word/2006/wordml" xmlns:wps="http://schemas.microsoft.com/office/word/2010/wordprocessingShape" mc:Ignorable="w14 w15 w16se w16cid w16 w16cex w16sdtdh wp14">
+<w:endnotes xmlns:wpc="http://schemas.microsoft.com/office/word/2010/wordprocessingCanvas" xmlns:cx="http://schemas.microsoft.com/office/drawing/2014/chartex" xmlns:cx1="http://schemas.microsoft.com/office/drawing/2015/9/8/chartex" xmlns:cx2="http://schemas.microsoft.com/office/drawing/2015/10/21/chartex" xmlns:cx3="http://schemas.microsoft.com/office/drawing/2016/5/9/chartex" xmlns:cx4="http://schemas.microsoft.com/office/drawing/2016/5/10/chartex" xmlns:cx5="http://schemas.microsoft.com/office/drawing/2016/5/11/chartex" xmlns:cx6="http://schemas.microsoft.com/office/drawing/2016/5/12/chartex" xmlns:cx7="http://schemas.microsoft.com/office/drawing/2016/5/13/chartex" xmlns:cx8="http://schemas.microsoft.com/office/drawing/2016/5/14/chartex" xmlns:mc="http://schemas.openxmlformats.org/markup-compatibility/2006" xmlns:aink="http://schemas.microsoft.com/office/drawing/2016/ink" xmlns:am3d="http://schemas.microsoft.com/office/drawing/2017/model3d" xmlns:o="urn:schemas-microsoft-com:office:office" xmlns:oel="http://schemas.microsoft.com/office/2019/extlst" xmlns:r="http://schemas.openxmlformats.org/officeDocument/2006/relationships" xmlns:m="http://schemas.openxmlformats.org/officeDocument/2006/math" xmlns:v="urn:schemas-microsoft-com:vml" xmlns:wp14="http://schemas.microsoft.com/office/word/2010/wordprocessingDrawing" xmlns:wp="http://schemas.openxmlformats.org/drawingml/2006/wordprocessingDrawing" xmlns:w10="urn:schemas-microsoft-com:office:word" xmlns:w="http://schemas.openxmlformats.org/wordprocessingml/2006/main" xmlns:w14="http://schemas.microsoft.com/office/word/2010/wordml" xmlns:w15="http://schemas.microsoft.com/office/word/2012/wordml" xmlns:w16cex="http://schemas.microsoft.com/office/word/2018/wordml/cex" xmlns:w16cid="http://schemas.microsoft.com/office/word/2016/wordml/cid" xmlns:w16="http://schemas.microsoft.com/office/word/2018/wordml" xmlns:w16du="http://schemas.microsoft.com/office/word/2023/wordml/word16du" xmlns:w16sdtdh="http://schemas.microsoft.com/office/word/2020/wordml/sdtdatahash" xmlns:w16sdtfl="http://schemas.microsoft.com/office/word/2024/wordml/sdtformatlock" xmlns:w16se="http://schemas.microsoft.com/office/word/2015/wordml/symex" xmlns:wpg="http://schemas.microsoft.com/office/word/2010/wordprocessingGroup" xmlns:wpi="http://schemas.microsoft.com/office/word/2010/wordprocessingInk" xmlns:wne="http://schemas.microsoft.com/office/word/2006/wordml" xmlns:wps="http://schemas.microsoft.com/office/word/2010/wordprocessingShape" mc:Ignorable="w14 w15 w16se w16cid w16 w16cex w16sdtdh w16sdtfl w16du wp14">
   <w:endnote w:type="separator" w:id="-1">
     <w:p>
       <w:r>
@@ -1232,37 +1126,37 @@
 </file>
 
 <file path=word/footer1.xml><?xml version="1.0" encoding="utf-8"?>
-<w:ftr xmlns:wpc="http://schemas.microsoft.com/office/word/2010/wordprocessingCanvas" xmlns:cx="http://schemas.microsoft.com/office/drawing/2014/chartex" xmlns:cx1="http://schemas.microsoft.com/office/drawing/2015/9/8/chartex" xmlns:cx2="http://schemas.microsoft.com/office/drawing/2015/10/21/chartex" xmlns:cx3="http://schemas.microsoft.com/office/drawing/2016/5/9/chartex" xmlns:cx4="http://schemas.microsoft.com/office/drawing/2016/5/10/chartex" xmlns:cx5="http://schemas.microsoft.com/office/drawing/2016/5/11/chartex" xmlns:cx6="http://schemas.microsoft.com/office/drawing/2016/5/12/chartex" xmlns:cx7="http://schemas.microsoft.com/office/drawing/2016/5/13/chartex" xmlns:cx8="http://schemas.microsoft.com/office/drawing/2016/5/14/chartex" xmlns:mc="http://schemas.openxmlformats.org/markup-compatibility/2006" xmlns:aink="http://schemas.microsoft.com/office/drawing/2016/ink" xmlns:am3d="http://schemas.microsoft.com/office/drawing/2017/model3d" xmlns:o="urn:schemas-microsoft-com:office:office" xmlns:oel="http://schemas.microsoft.com/office/2019/extlst" xmlns:r="http://schemas.openxmlformats.org/officeDocument/2006/relationships" xmlns:m="http://schemas.openxmlformats.org/officeDocument/2006/math" xmlns:v="urn:schemas-microsoft-com:vml" xmlns:wp14="http://schemas.microsoft.com/office/word/2010/wordprocessingDrawing" xmlns:wp="http://schemas.openxmlformats.org/drawingml/2006/wordprocessingDrawing" xmlns:w10="urn:schemas-microsoft-com:office:word" xmlns:w="http://schemas.openxmlformats.org/wordprocessingml/2006/main" xmlns:w14="http://schemas.microsoft.com/office/word/2010/wordml" xmlns:w15="http://schemas.microsoft.com/office/word/2012/wordml" xmlns:w16cex="http://schemas.microsoft.com/office/word/2018/wordml/cex" xmlns:w16cid="http://schemas.microsoft.com/office/word/2016/wordml/cid" xmlns:w16="http://schemas.microsoft.com/office/word/2018/wordml" xmlns:w16sdtdh="http://schemas.microsoft.com/office/word/2020/wordml/sdtdatahash" xmlns:w16se="http://schemas.microsoft.com/office/word/2015/wordml/symex" xmlns:wpg="http://schemas.microsoft.com/office/word/2010/wordprocessingGroup" xmlns:wpi="http://schemas.microsoft.com/office/word/2010/wordprocessingInk" xmlns:wne="http://schemas.microsoft.com/office/word/2006/wordml" xmlns:wps="http://schemas.microsoft.com/office/word/2010/wordprocessingShape" mc:Ignorable="w14 w15 w16se w16cid w16 w16cex w16sdtdh wp14">
+<w:ftr xmlns:wpc="http://schemas.microsoft.com/office/word/2010/wordprocessingCanvas" xmlns:cx="http://schemas.microsoft.com/office/drawing/2014/chartex" xmlns:cx1="http://schemas.microsoft.com/office/drawing/2015/9/8/chartex" xmlns:cx2="http://schemas.microsoft.com/office/drawing/2015/10/21/chartex" xmlns:cx3="http://schemas.microsoft.com/office/drawing/2016/5/9/chartex" xmlns:cx4="http://schemas.microsoft.com/office/drawing/2016/5/10/chartex" xmlns:cx5="http://schemas.microsoft.com/office/drawing/2016/5/11/chartex" xmlns:cx6="http://schemas.microsoft.com/office/drawing/2016/5/12/chartex" xmlns:cx7="http://schemas.microsoft.com/office/drawing/2016/5/13/chartex" xmlns:cx8="http://schemas.microsoft.com/office/drawing/2016/5/14/chartex" xmlns:mc="http://schemas.openxmlformats.org/markup-compatibility/2006" xmlns:aink="http://schemas.microsoft.com/office/drawing/2016/ink" xmlns:am3d="http://schemas.microsoft.com/office/drawing/2017/model3d" xmlns:o="urn:schemas-microsoft-com:office:office" xmlns:oel="http://schemas.microsoft.com/office/2019/extlst" xmlns:r="http://schemas.openxmlformats.org/officeDocument/2006/relationships" xmlns:m="http://schemas.openxmlformats.org/officeDocument/2006/math" xmlns:v="urn:schemas-microsoft-com:vml" xmlns:wp14="http://schemas.microsoft.com/office/word/2010/wordprocessingDrawing" xmlns:wp="http://schemas.openxmlformats.org/drawingml/2006/wordprocessingDrawing" xmlns:w10="urn:schemas-microsoft-com:office:word" xmlns:w="http://schemas.openxmlformats.org/wordprocessingml/2006/main" xmlns:w14="http://schemas.microsoft.com/office/word/2010/wordml" xmlns:w15="http://schemas.microsoft.com/office/word/2012/wordml" xmlns:w16cex="http://schemas.microsoft.com/office/word/2018/wordml/cex" xmlns:w16cid="http://schemas.microsoft.com/office/word/2016/wordml/cid" xmlns:w16="http://schemas.microsoft.com/office/word/2018/wordml" xmlns:w16du="http://schemas.microsoft.com/office/word/2023/wordml/word16du" xmlns:w16sdtdh="http://schemas.microsoft.com/office/word/2020/wordml/sdtdatahash" xmlns:w16sdtfl="http://schemas.microsoft.com/office/word/2024/wordml/sdtformatlock" xmlns:w16se="http://schemas.microsoft.com/office/word/2015/wordml/symex" xmlns:wpg="http://schemas.microsoft.com/office/word/2010/wordprocessingGroup" xmlns:wpi="http://schemas.microsoft.com/office/word/2010/wordprocessingInk" xmlns:wne="http://schemas.microsoft.com/office/word/2006/wordml" xmlns:wps="http://schemas.microsoft.com/office/word/2010/wordprocessingShape" mc:Ignorable="w14 w15 w16se w16cid w16 w16cex w16sdtdh w16sdtfl w16du wp14">
   <w:p>
     <w:pPr>
-      <w:pStyle w:val="Rodap"/>
+      <w:pStyle w:val="Footer"/>
     </w:pPr>
   </w:p>
 </w:ftr>
 </file>
 
 <file path=word/footer2.xml><?xml version="1.0" encoding="utf-8"?>
-<w:ftr xmlns:wpc="http://schemas.microsoft.com/office/word/2010/wordprocessingCanvas" xmlns:cx="http://schemas.microsoft.com/office/drawing/2014/chartex" xmlns:cx1="http://schemas.microsoft.com/office/drawing/2015/9/8/chartex" xmlns:cx2="http://schemas.microsoft.com/office/drawing/2015/10/21/chartex" xmlns:cx3="http://schemas.microsoft.com/office/drawing/2016/5/9/chartex" xmlns:cx4="http://schemas.microsoft.com/office/drawing/2016/5/10/chartex" xmlns:cx5="http://schemas.microsoft.com/office/drawing/2016/5/11/chartex" xmlns:cx6="http://schemas.microsoft.com/office/drawing/2016/5/12/chartex" xmlns:cx7="http://schemas.microsoft.com/office/drawing/2016/5/13/chartex" xmlns:cx8="http://schemas.microsoft.com/office/drawing/2016/5/14/chartex" xmlns:mc="http://schemas.openxmlformats.org/markup-compatibility/2006" xmlns:aink="http://schemas.microsoft.com/office/drawing/2016/ink" xmlns:am3d="http://schemas.microsoft.com/office/drawing/2017/model3d" xmlns:o="urn:schemas-microsoft-com:office:office" xmlns:oel="http://schemas.microsoft.com/office/2019/extlst" xmlns:r="http://schemas.openxmlformats.org/officeDocument/2006/relationships" xmlns:m="http://schemas.openxmlformats.org/officeDocument/2006/math" xmlns:v="urn:schemas-microsoft-com:vml" xmlns:wp14="http://schemas.microsoft.com/office/word/2010/wordprocessingDrawing" xmlns:wp="http://schemas.openxmlformats.org/drawingml/2006/wordprocessingDrawing" xmlns:w10="urn:schemas-microsoft-com:office:word" xmlns:w="http://schemas.openxmlformats.org/wordprocessingml/2006/main" xmlns:w14="http://schemas.microsoft.com/office/word/2010/wordml" xmlns:w15="http://schemas.microsoft.com/office/word/2012/wordml" xmlns:w16cex="http://schemas.microsoft.com/office/word/2018/wordml/cex" xmlns:w16cid="http://schemas.microsoft.com/office/word/2016/wordml/cid" xmlns:w16="http://schemas.microsoft.com/office/word/2018/wordml" xmlns:w16sdtdh="http://schemas.microsoft.com/office/word/2020/wordml/sdtdatahash" xmlns:w16se="http://schemas.microsoft.com/office/word/2015/wordml/symex" xmlns:wpg="http://schemas.microsoft.com/office/word/2010/wordprocessingGroup" xmlns:wpi="http://schemas.microsoft.com/office/word/2010/wordprocessingInk" xmlns:wne="http://schemas.microsoft.com/office/word/2006/wordml" xmlns:wps="http://schemas.microsoft.com/office/word/2010/wordprocessingShape" mc:Ignorable="w14 w15 w16se w16cid w16 w16cex w16sdtdh wp14">
+<w:ftr xmlns:wpc="http://schemas.microsoft.com/office/word/2010/wordprocessingCanvas" xmlns:cx="http://schemas.microsoft.com/office/drawing/2014/chartex" xmlns:cx1="http://schemas.microsoft.com/office/drawing/2015/9/8/chartex" xmlns:cx2="http://schemas.microsoft.com/office/drawing/2015/10/21/chartex" xmlns:cx3="http://schemas.microsoft.com/office/drawing/2016/5/9/chartex" xmlns:cx4="http://schemas.microsoft.com/office/drawing/2016/5/10/chartex" xmlns:cx5="http://schemas.microsoft.com/office/drawing/2016/5/11/chartex" xmlns:cx6="http://schemas.microsoft.com/office/drawing/2016/5/12/chartex" xmlns:cx7="http://schemas.microsoft.com/office/drawing/2016/5/13/chartex" xmlns:cx8="http://schemas.microsoft.com/office/drawing/2016/5/14/chartex" xmlns:mc="http://schemas.openxmlformats.org/markup-compatibility/2006" xmlns:aink="http://schemas.microsoft.com/office/drawing/2016/ink" xmlns:am3d="http://schemas.microsoft.com/office/drawing/2017/model3d" xmlns:o="urn:schemas-microsoft-com:office:office" xmlns:oel="http://schemas.microsoft.com/office/2019/extlst" xmlns:r="http://schemas.openxmlformats.org/officeDocument/2006/relationships" xmlns:m="http://schemas.openxmlformats.org/officeDocument/2006/math" xmlns:v="urn:schemas-microsoft-com:vml" xmlns:wp14="http://schemas.microsoft.com/office/word/2010/wordprocessingDrawing" xmlns:wp="http://schemas.openxmlformats.org/drawingml/2006/wordprocessingDrawing" xmlns:w10="urn:schemas-microsoft-com:office:word" xmlns:w="http://schemas.openxmlformats.org/wordprocessingml/2006/main" xmlns:w14="http://schemas.microsoft.com/office/word/2010/wordml" xmlns:w15="http://schemas.microsoft.com/office/word/2012/wordml" xmlns:w16cex="http://schemas.microsoft.com/office/word/2018/wordml/cex" xmlns:w16cid="http://schemas.microsoft.com/office/word/2016/wordml/cid" xmlns:w16="http://schemas.microsoft.com/office/word/2018/wordml" xmlns:w16du="http://schemas.microsoft.com/office/word/2023/wordml/word16du" xmlns:w16sdtdh="http://schemas.microsoft.com/office/word/2020/wordml/sdtdatahash" xmlns:w16sdtfl="http://schemas.microsoft.com/office/word/2024/wordml/sdtformatlock" xmlns:w16se="http://schemas.microsoft.com/office/word/2015/wordml/symex" xmlns:wpg="http://schemas.microsoft.com/office/word/2010/wordprocessingGroup" xmlns:wpi="http://schemas.microsoft.com/office/word/2010/wordprocessingInk" xmlns:wne="http://schemas.microsoft.com/office/word/2006/wordml" xmlns:wps="http://schemas.microsoft.com/office/word/2010/wordprocessingShape" mc:Ignorable="w14 w15 w16se w16cid w16 w16cex w16sdtdh w16sdtfl w16du wp14">
   <w:p>
     <w:pPr>
-      <w:pStyle w:val="Rodap"/>
+      <w:pStyle w:val="Footer"/>
     </w:pPr>
   </w:p>
 </w:ftr>
 </file>
 
 <file path=word/footer3.xml><?xml version="1.0" encoding="utf-8"?>
-<w:ftr xmlns:wpc="http://schemas.microsoft.com/office/word/2010/wordprocessingCanvas" xmlns:cx="http://schemas.microsoft.com/office/drawing/2014/chartex" xmlns:cx1="http://schemas.microsoft.com/office/drawing/2015/9/8/chartex" xmlns:cx2="http://schemas.microsoft.com/office/drawing/2015/10/21/chartex" xmlns:cx3="http://schemas.microsoft.com/office/drawing/2016/5/9/chartex" xmlns:cx4="http://schemas.microsoft.com/office/drawing/2016/5/10/chartex" xmlns:cx5="http://schemas.microsoft.com/office/drawing/2016/5/11/chartex" xmlns:cx6="http://schemas.microsoft.com/office/drawing/2016/5/12/chartex" xmlns:cx7="http://schemas.microsoft.com/office/drawing/2016/5/13/chartex" xmlns:cx8="http://schemas.microsoft.com/office/drawing/2016/5/14/chartex" xmlns:mc="http://schemas.openxmlformats.org/markup-compatibility/2006" xmlns:aink="http://schemas.microsoft.com/office/drawing/2016/ink" xmlns:am3d="http://schemas.microsoft.com/office/drawing/2017/model3d" xmlns:o="urn:schemas-microsoft-com:office:office" xmlns:oel="http://schemas.microsoft.com/office/2019/extlst" xmlns:r="http://schemas.openxmlformats.org/officeDocument/2006/relationships" xmlns:m="http://schemas.openxmlformats.org/officeDocument/2006/math" xmlns:v="urn:schemas-microsoft-com:vml" xmlns:wp14="http://schemas.microsoft.com/office/word/2010/wordprocessingDrawing" xmlns:wp="http://schemas.openxmlformats.org/drawingml/2006/wordprocessingDrawing" xmlns:w10="urn:schemas-microsoft-com:office:word" xmlns:w="http://schemas.openxmlformats.org/wordprocessingml/2006/main" xmlns:w14="http://schemas.microsoft.com/office/word/2010/wordml" xmlns:w15="http://schemas.microsoft.com/office/word/2012/wordml" xmlns:w16cex="http://schemas.microsoft.com/office/word/2018/wordml/cex" xmlns:w16cid="http://schemas.microsoft.com/office/word/2016/wordml/cid" xmlns:w16="http://schemas.microsoft.com/office/word/2018/wordml" xmlns:w16sdtdh="http://schemas.microsoft.com/office/word/2020/wordml/sdtdatahash" xmlns:w16se="http://schemas.microsoft.com/office/word/2015/wordml/symex" xmlns:wpg="http://schemas.microsoft.com/office/word/2010/wordprocessingGroup" xmlns:wpi="http://schemas.microsoft.com/office/word/2010/wordprocessingInk" xmlns:wne="http://schemas.microsoft.com/office/word/2006/wordml" xmlns:wps="http://schemas.microsoft.com/office/word/2010/wordprocessingShape" mc:Ignorable="w14 w15 w16se w16cid w16 w16cex w16sdtdh wp14">
+<w:ftr xmlns:wpc="http://schemas.microsoft.com/office/word/2010/wordprocessingCanvas" xmlns:cx="http://schemas.microsoft.com/office/drawing/2014/chartex" xmlns:cx1="http://schemas.microsoft.com/office/drawing/2015/9/8/chartex" xmlns:cx2="http://schemas.microsoft.com/office/drawing/2015/10/21/chartex" xmlns:cx3="http://schemas.microsoft.com/office/drawing/2016/5/9/chartex" xmlns:cx4="http://schemas.microsoft.com/office/drawing/2016/5/10/chartex" xmlns:cx5="http://schemas.microsoft.com/office/drawing/2016/5/11/chartex" xmlns:cx6="http://schemas.microsoft.com/office/drawing/2016/5/12/chartex" xmlns:cx7="http://schemas.microsoft.com/office/drawing/2016/5/13/chartex" xmlns:cx8="http://schemas.microsoft.com/office/drawing/2016/5/14/chartex" xmlns:mc="http://schemas.openxmlformats.org/markup-compatibility/2006" xmlns:aink="http://schemas.microsoft.com/office/drawing/2016/ink" xmlns:am3d="http://schemas.microsoft.com/office/drawing/2017/model3d" xmlns:o="urn:schemas-microsoft-com:office:office" xmlns:oel="http://schemas.microsoft.com/office/2019/extlst" xmlns:r="http://schemas.openxmlformats.org/officeDocument/2006/relationships" xmlns:m="http://schemas.openxmlformats.org/officeDocument/2006/math" xmlns:v="urn:schemas-microsoft-com:vml" xmlns:wp14="http://schemas.microsoft.com/office/word/2010/wordprocessingDrawing" xmlns:wp="http://schemas.openxmlformats.org/drawingml/2006/wordprocessingDrawing" xmlns:w10="urn:schemas-microsoft-com:office:word" xmlns:w="http://schemas.openxmlformats.org/wordprocessingml/2006/main" xmlns:w14="http://schemas.microsoft.com/office/word/2010/wordml" xmlns:w15="http://schemas.microsoft.com/office/word/2012/wordml" xmlns:w16cex="http://schemas.microsoft.com/office/word/2018/wordml/cex" xmlns:w16cid="http://schemas.microsoft.com/office/word/2016/wordml/cid" xmlns:w16="http://schemas.microsoft.com/office/word/2018/wordml" xmlns:w16du="http://schemas.microsoft.com/office/word/2023/wordml/word16du" xmlns:w16sdtdh="http://schemas.microsoft.com/office/word/2020/wordml/sdtdatahash" xmlns:w16sdtfl="http://schemas.microsoft.com/office/word/2024/wordml/sdtformatlock" xmlns:w16se="http://schemas.microsoft.com/office/word/2015/wordml/symex" xmlns:wpg="http://schemas.microsoft.com/office/word/2010/wordprocessingGroup" xmlns:wpi="http://schemas.microsoft.com/office/word/2010/wordprocessingInk" xmlns:wne="http://schemas.microsoft.com/office/word/2006/wordml" xmlns:wps="http://schemas.microsoft.com/office/word/2010/wordprocessingShape" mc:Ignorable="w14 w15 w16se w16cid w16 w16cex w16sdtdh w16sdtfl w16du wp14">
   <w:p>
     <w:pPr>
-      <w:pStyle w:val="Rodap"/>
+      <w:pStyle w:val="Footer"/>
     </w:pPr>
   </w:p>
 </w:ftr>
 </file>
 
 <file path=word/footnotes.xml><?xml version="1.0" encoding="utf-8"?>
-<w:footnotes xmlns:wpc="http://schemas.microsoft.com/office/word/2010/wordprocessingCanvas" xmlns:cx="http://schemas.microsoft.com/office/drawing/2014/chartex" xmlns:cx1="http://schemas.microsoft.com/office/drawing/2015/9/8/chartex" xmlns:cx2="http://schemas.microsoft.com/office/drawing/2015/10/21/chartex" xmlns:cx3="http://schemas.microsoft.com/office/drawing/2016/5/9/chartex" xmlns:cx4="http://schemas.microsoft.com/office/drawing/2016/5/10/chartex" xmlns:cx5="http://schemas.microsoft.com/office/drawing/2016/5/11/chartex" xmlns:cx6="http://schemas.microsoft.com/office/drawing/2016/5/12/chartex" xmlns:cx7="http://schemas.microsoft.com/office/drawing/2016/5/13/chartex" xmlns:cx8="http://schemas.microsoft.com/office/drawing/2016/5/14/chartex" xmlns:mc="http://schemas.openxmlformats.org/markup-compatibility/2006" xmlns:aink="http://schemas.microsoft.com/office/drawing/2016/ink" xmlns:am3d="http://schemas.microsoft.com/office/drawing/2017/model3d" xmlns:o="urn:schemas-microsoft-com:office:office" xmlns:oel="http://schemas.microsoft.com/office/2019/extlst" xmlns:r="http://schemas.openxmlformats.org/officeDocument/2006/relationships" xmlns:m="http://schemas.openxmlformats.org/officeDocument/2006/math" xmlns:v="urn:schemas-microsoft-com:vml" xmlns:wp14="http://schemas.microsoft.com/office/word/2010/wordprocessingDrawing" xmlns:wp="http://schemas.openxmlformats.org/drawingml/2006/wordprocessingDrawing" xmlns:w10="urn:schemas-microsoft-com:office:word" xmlns:w="http://schemas.openxmlformats.org/wordprocessingml/2006/main" xmlns:w14="http://schemas.microsoft.com/office/word/2010/wordml" xmlns:w15="http://schemas.microsoft.com/office/word/2012/wordml" xmlns:w16cex="http://schemas.microsoft.com/office/word/2018/wordml/cex" xmlns:w16cid="http://schemas.microsoft.com/office/word/2016/wordml/cid" xmlns:w16="http://schemas.microsoft.com/office/word/2018/wordml" xmlns:w16sdtdh="http://schemas.microsoft.com/office/word/2020/wordml/sdtdatahash" xmlns:w16se="http://schemas.microsoft.com/office/word/2015/wordml/symex" xmlns:wpg="http://schemas.microsoft.com/office/word/2010/wordprocessingGroup" xmlns:wpi="http://schemas.microsoft.com/office/word/2010/wordprocessingInk" xmlns:wne="http://schemas.microsoft.com/office/word/2006/wordml" xmlns:wps="http://schemas.microsoft.com/office/word/2010/wordprocessingShape" mc:Ignorable="w14 w15 w16se w16cid w16 w16cex w16sdtdh wp14">
+<w:footnotes xmlns:wpc="http://schemas.microsoft.com/office/word/2010/wordprocessingCanvas" xmlns:cx="http://schemas.microsoft.com/office/drawing/2014/chartex" xmlns:cx1="http://schemas.microsoft.com/office/drawing/2015/9/8/chartex" xmlns:cx2="http://schemas.microsoft.com/office/drawing/2015/10/21/chartex" xmlns:cx3="http://schemas.microsoft.com/office/drawing/2016/5/9/chartex" xmlns:cx4="http://schemas.microsoft.com/office/drawing/2016/5/10/chartex" xmlns:cx5="http://schemas.microsoft.com/office/drawing/2016/5/11/chartex" xmlns:cx6="http://schemas.microsoft.com/office/drawing/2016/5/12/chartex" xmlns:cx7="http://schemas.microsoft.com/office/drawing/2016/5/13/chartex" xmlns:cx8="http://schemas.microsoft.com/office/drawing/2016/5/14/chartex" xmlns:mc="http://schemas.openxmlformats.org/markup-compatibility/2006" xmlns:aink="http://schemas.microsoft.com/office/drawing/2016/ink" xmlns:am3d="http://schemas.microsoft.com/office/drawing/2017/model3d" xmlns:o="urn:schemas-microsoft-com:office:office" xmlns:oel="http://schemas.microsoft.com/office/2019/extlst" xmlns:r="http://schemas.openxmlformats.org/officeDocument/2006/relationships" xmlns:m="http://schemas.openxmlformats.org/officeDocument/2006/math" xmlns:v="urn:schemas-microsoft-com:vml" xmlns:wp14="http://schemas.microsoft.com/office/word/2010/wordprocessingDrawing" xmlns:wp="http://schemas.openxmlformats.org/drawingml/2006/wordprocessingDrawing" xmlns:w10="urn:schemas-microsoft-com:office:word" xmlns:w="http://schemas.openxmlformats.org/wordprocessingml/2006/main" xmlns:w14="http://schemas.microsoft.com/office/word/2010/wordml" xmlns:w15="http://schemas.microsoft.com/office/word/2012/wordml" xmlns:w16cex="http://schemas.microsoft.com/office/word/2018/wordml/cex" xmlns:w16cid="http://schemas.microsoft.com/office/word/2016/wordml/cid" xmlns:w16="http://schemas.microsoft.com/office/word/2018/wordml" xmlns:w16du="http://schemas.microsoft.com/office/word/2023/wordml/word16du" xmlns:w16sdtdh="http://schemas.microsoft.com/office/word/2020/wordml/sdtdatahash" xmlns:w16sdtfl="http://schemas.microsoft.com/office/word/2024/wordml/sdtformatlock" xmlns:w16se="http://schemas.microsoft.com/office/word/2015/wordml/symex" xmlns:wpg="http://schemas.microsoft.com/office/word/2010/wordprocessingGroup" xmlns:wpi="http://schemas.microsoft.com/office/word/2010/wordprocessingInk" xmlns:wne="http://schemas.microsoft.com/office/word/2006/wordml" xmlns:wps="http://schemas.microsoft.com/office/word/2010/wordprocessingShape" mc:Ignorable="w14 w15 w16se w16cid w16 w16cex w16sdtdh w16sdtfl w16du wp14">
   <w:footnote w:type="separator" w:id="-1">
     <w:p>
       <w:r>
@@ -1281,10 +1175,10 @@
 </file>
 
 <file path=word/header1.xml><?xml version="1.0" encoding="utf-8"?>
-<w:hdr xmlns:wpc="http://schemas.microsoft.com/office/word/2010/wordprocessingCanvas" xmlns:cx="http://schemas.microsoft.com/office/drawing/2014/chartex" xmlns:cx1="http://schemas.microsoft.com/office/drawing/2015/9/8/chartex" xmlns:cx2="http://schemas.microsoft.com/office/drawing/2015/10/21/chartex" xmlns:cx3="http://schemas.microsoft.com/office/drawing/2016/5/9/chartex" xmlns:cx4="http://schemas.microsoft.com/office/drawing/2016/5/10/chartex" xmlns:cx5="http://schemas.microsoft.com/office/drawing/2016/5/11/chartex" xmlns:cx6="http://schemas.microsoft.com/office/drawing/2016/5/12/chartex" xmlns:cx7="http://schemas.microsoft.com/office/drawing/2016/5/13/chartex" xmlns:cx8="http://schemas.microsoft.com/office/drawing/2016/5/14/chartex" xmlns:mc="http://schemas.openxmlformats.org/markup-compatibility/2006" xmlns:aink="http://schemas.microsoft.com/office/drawing/2016/ink" xmlns:am3d="http://schemas.microsoft.com/office/drawing/2017/model3d" xmlns:o="urn:schemas-microsoft-com:office:office" xmlns:oel="http://schemas.microsoft.com/office/2019/extlst" xmlns:r="http://schemas.openxmlformats.org/officeDocument/2006/relationships" xmlns:m="http://schemas.openxmlformats.org/officeDocument/2006/math" xmlns:v="urn:schemas-microsoft-com:vml" xmlns:wp14="http://schemas.microsoft.com/office/word/2010/wordprocessingDrawing" xmlns:wp="http://schemas.openxmlformats.org/drawingml/2006/wordprocessingDrawing" xmlns:w10="urn:schemas-microsoft-com:office:word" xmlns:w="http://schemas.openxmlformats.org/wordprocessingml/2006/main" xmlns:w14="http://schemas.microsoft.com/office/word/2010/wordml" xmlns:w15="http://schemas.microsoft.com/office/word/2012/wordml" xmlns:w16cex="http://schemas.microsoft.com/office/word/2018/wordml/cex" xmlns:w16cid="http://schemas.microsoft.com/office/word/2016/wordml/cid" xmlns:w16="http://schemas.microsoft.com/office/word/2018/wordml" xmlns:w16sdtdh="http://schemas.microsoft.com/office/word/2020/wordml/sdtdatahash" xmlns:w16se="http://schemas.microsoft.com/office/word/2015/wordml/symex" xmlns:wpg="http://schemas.microsoft.com/office/word/2010/wordprocessingGroup" xmlns:wpi="http://schemas.microsoft.com/office/word/2010/wordprocessingInk" xmlns:wne="http://schemas.microsoft.com/office/word/2006/wordml" xmlns:wps="http://schemas.microsoft.com/office/word/2010/wordprocessingShape" mc:Ignorable="w14 w15 w16se w16cid w16 w16cex w16sdtdh wp14">
+<w:hdr xmlns:wpc="http://schemas.microsoft.com/office/word/2010/wordprocessingCanvas" xmlns:cx="http://schemas.microsoft.com/office/drawing/2014/chartex" xmlns:cx1="http://schemas.microsoft.com/office/drawing/2015/9/8/chartex" xmlns:cx2="http://schemas.microsoft.com/office/drawing/2015/10/21/chartex" xmlns:cx3="http://schemas.microsoft.com/office/drawing/2016/5/9/chartex" xmlns:cx4="http://schemas.microsoft.com/office/drawing/2016/5/10/chartex" xmlns:cx5="http://schemas.microsoft.com/office/drawing/2016/5/11/chartex" xmlns:cx6="http://schemas.microsoft.com/office/drawing/2016/5/12/chartex" xmlns:cx7="http://schemas.microsoft.com/office/drawing/2016/5/13/chartex" xmlns:cx8="http://schemas.microsoft.com/office/drawing/2016/5/14/chartex" xmlns:mc="http://schemas.openxmlformats.org/markup-compatibility/2006" xmlns:aink="http://schemas.microsoft.com/office/drawing/2016/ink" xmlns:am3d="http://schemas.microsoft.com/office/drawing/2017/model3d" xmlns:o="urn:schemas-microsoft-com:office:office" xmlns:oel="http://schemas.microsoft.com/office/2019/extlst" xmlns:r="http://schemas.openxmlformats.org/officeDocument/2006/relationships" xmlns:m="http://schemas.openxmlformats.org/officeDocument/2006/math" xmlns:v="urn:schemas-microsoft-com:vml" xmlns:wp14="http://schemas.microsoft.com/office/word/2010/wordprocessingDrawing" xmlns:wp="http://schemas.openxmlformats.org/drawingml/2006/wordprocessingDrawing" xmlns:w10="urn:schemas-microsoft-com:office:word" xmlns:w="http://schemas.openxmlformats.org/wordprocessingml/2006/main" xmlns:w14="http://schemas.microsoft.com/office/word/2010/wordml" xmlns:w15="http://schemas.microsoft.com/office/word/2012/wordml" xmlns:w16cex="http://schemas.microsoft.com/office/word/2018/wordml/cex" xmlns:w16cid="http://schemas.microsoft.com/office/word/2016/wordml/cid" xmlns:w16="http://schemas.microsoft.com/office/word/2018/wordml" xmlns:w16du="http://schemas.microsoft.com/office/word/2023/wordml/word16du" xmlns:w16sdtdh="http://schemas.microsoft.com/office/word/2020/wordml/sdtdatahash" xmlns:w16sdtfl="http://schemas.microsoft.com/office/word/2024/wordml/sdtformatlock" xmlns:w16se="http://schemas.microsoft.com/office/word/2015/wordml/symex" xmlns:wpg="http://schemas.microsoft.com/office/word/2010/wordprocessingGroup" xmlns:wpi="http://schemas.microsoft.com/office/word/2010/wordprocessingInk" xmlns:wne="http://schemas.microsoft.com/office/word/2006/wordml" xmlns:wps="http://schemas.microsoft.com/office/word/2010/wordprocessingShape" mc:Ignorable="w14 w15 w16se w16cid w16 w16cex w16sdtdh w16sdtfl w16du wp14">
   <w:p>
     <w:pPr>
-      <w:pStyle w:val="Cabealho"/>
+      <w:pStyle w:val="Header"/>
     </w:pPr>
     <w:r>
       <w:rPr>
@@ -1318,6 +1212,7 @@
         <v:shape id="PowerPlusWaterMarkObject61354407" o:spid="_x0000_s1042" type="#_x0000_t136" style="position:absolute;margin-left:0;margin-top:0;width:238.5pt;height:106.5pt;z-index:-251658240;mso-position-horizontal:center;mso-position-horizontal-relative:margin;mso-position-vertical:center;mso-position-vertical-relative:margin" o:allowincell="f" fillcolor="silver" stroked="f">
           <v:fill opacity=".5"/>
           <v:textpath style="font-family:&quot;Yu Gothic UI Semibold&quot;;font-size:80pt" string="UNISA"/>
+          <w10:wrap anchorx="margin" anchory="margin"/>
         </v:shape>
       </w:pict>
     </w:r>
@@ -1326,10 +1221,10 @@
 </file>
 
 <file path=word/header2.xml><?xml version="1.0" encoding="utf-8"?>
-<w:hdr xmlns:wpc="http://schemas.microsoft.com/office/word/2010/wordprocessingCanvas" xmlns:cx="http://schemas.microsoft.com/office/drawing/2014/chartex" xmlns:cx1="http://schemas.microsoft.com/office/drawing/2015/9/8/chartex" xmlns:cx2="http://schemas.microsoft.com/office/drawing/2015/10/21/chartex" xmlns:cx3="http://schemas.microsoft.com/office/drawing/2016/5/9/chartex" xmlns:cx4="http://schemas.microsoft.com/office/drawing/2016/5/10/chartex" xmlns:cx5="http://schemas.microsoft.com/office/drawing/2016/5/11/chartex" xmlns:cx6="http://schemas.microsoft.com/office/drawing/2016/5/12/chartex" xmlns:cx7="http://schemas.microsoft.com/office/drawing/2016/5/13/chartex" xmlns:cx8="http://schemas.microsoft.com/office/drawing/2016/5/14/chartex" xmlns:mc="http://schemas.openxmlformats.org/markup-compatibility/2006" xmlns:aink="http://schemas.microsoft.com/office/drawing/2016/ink" xmlns:am3d="http://schemas.microsoft.com/office/drawing/2017/model3d" xmlns:o="urn:schemas-microsoft-com:office:office" xmlns:oel="http://schemas.microsoft.com/office/2019/extlst" xmlns:r="http://schemas.openxmlformats.org/officeDocument/2006/relationships" xmlns:m="http://schemas.openxmlformats.org/officeDocument/2006/math" xmlns:v="urn:schemas-microsoft-com:vml" xmlns:wp14="http://schemas.microsoft.com/office/word/2010/wordprocessingDrawing" xmlns:wp="http://schemas.openxmlformats.org/drawingml/2006/wordprocessingDrawing" xmlns:w10="urn:schemas-microsoft-com:office:word" xmlns:w="http://schemas.openxmlformats.org/wordprocessingml/2006/main" xmlns:w14="http://schemas.microsoft.com/office/word/2010/wordml" xmlns:w15="http://schemas.microsoft.com/office/word/2012/wordml" xmlns:w16cex="http://schemas.microsoft.com/office/word/2018/wordml/cex" xmlns:w16cid="http://schemas.microsoft.com/office/word/2016/wordml/cid" xmlns:w16="http://schemas.microsoft.com/office/word/2018/wordml" xmlns:w16sdtdh="http://schemas.microsoft.com/office/word/2020/wordml/sdtdatahash" xmlns:w16se="http://schemas.microsoft.com/office/word/2015/wordml/symex" xmlns:wpg="http://schemas.microsoft.com/office/word/2010/wordprocessingGroup" xmlns:wpi="http://schemas.microsoft.com/office/word/2010/wordprocessingInk" xmlns:wne="http://schemas.microsoft.com/office/word/2006/wordml" xmlns:wps="http://schemas.microsoft.com/office/word/2010/wordprocessingShape" mc:Ignorable="w14 w15 w16se w16cid w16 w16cex w16sdtdh wp14">
+<w:hdr xmlns:wpc="http://schemas.microsoft.com/office/word/2010/wordprocessingCanvas" xmlns:cx="http://schemas.microsoft.com/office/drawing/2014/chartex" xmlns:cx1="http://schemas.microsoft.com/office/drawing/2015/9/8/chartex" xmlns:cx2="http://schemas.microsoft.com/office/drawing/2015/10/21/chartex" xmlns:cx3="http://schemas.microsoft.com/office/drawing/2016/5/9/chartex" xmlns:cx4="http://schemas.microsoft.com/office/drawing/2016/5/10/chartex" xmlns:cx5="http://schemas.microsoft.com/office/drawing/2016/5/11/chartex" xmlns:cx6="http://schemas.microsoft.com/office/drawing/2016/5/12/chartex" xmlns:cx7="http://schemas.microsoft.com/office/drawing/2016/5/13/chartex" xmlns:cx8="http://schemas.microsoft.com/office/drawing/2016/5/14/chartex" xmlns:mc="http://schemas.openxmlformats.org/markup-compatibility/2006" xmlns:aink="http://schemas.microsoft.com/office/drawing/2016/ink" xmlns:am3d="http://schemas.microsoft.com/office/drawing/2017/model3d" xmlns:o="urn:schemas-microsoft-com:office:office" xmlns:oel="http://schemas.microsoft.com/office/2019/extlst" xmlns:r="http://schemas.openxmlformats.org/officeDocument/2006/relationships" xmlns:m="http://schemas.openxmlformats.org/officeDocument/2006/math" xmlns:v="urn:schemas-microsoft-com:vml" xmlns:wp14="http://schemas.microsoft.com/office/word/2010/wordprocessingDrawing" xmlns:wp="http://schemas.openxmlformats.org/drawingml/2006/wordprocessingDrawing" xmlns:w10="urn:schemas-microsoft-com:office:word" xmlns:w="http://schemas.openxmlformats.org/wordprocessingml/2006/main" xmlns:w14="http://schemas.microsoft.com/office/word/2010/wordml" xmlns:w15="http://schemas.microsoft.com/office/word/2012/wordml" xmlns:w16cex="http://schemas.microsoft.com/office/word/2018/wordml/cex" xmlns:w16cid="http://schemas.microsoft.com/office/word/2016/wordml/cid" xmlns:w16="http://schemas.microsoft.com/office/word/2018/wordml" xmlns:w16du="http://schemas.microsoft.com/office/word/2023/wordml/word16du" xmlns:w16sdtdh="http://schemas.microsoft.com/office/word/2020/wordml/sdtdatahash" xmlns:w16sdtfl="http://schemas.microsoft.com/office/word/2024/wordml/sdtformatlock" xmlns:w16se="http://schemas.microsoft.com/office/word/2015/wordml/symex" xmlns:wpg="http://schemas.microsoft.com/office/word/2010/wordprocessingGroup" xmlns:wpi="http://schemas.microsoft.com/office/word/2010/wordprocessingInk" xmlns:wne="http://schemas.microsoft.com/office/word/2006/wordml" xmlns:wps="http://schemas.microsoft.com/office/word/2010/wordprocessingShape" mc:Ignorable="w14 w15 w16se w16cid w16 w16cex w16sdtdh w16sdtfl w16du wp14">
   <w:p>
     <w:pPr>
-      <w:pStyle w:val="Cabealho"/>
+      <w:pStyle w:val="Header"/>
       <w:rPr>
         <w:noProof/>
       </w:rPr>
@@ -1366,6 +1261,7 @@
         <v:shape id="PowerPlusWaterMarkObject61354408" o:spid="_x0000_s1043" type="#_x0000_t136" style="position:absolute;margin-left:0;margin-top:0;width:238.5pt;height:106.5pt;z-index:-251657216;mso-position-horizontal:center;mso-position-horizontal-relative:margin;mso-position-vertical:center;mso-position-vertical-relative:margin" o:allowincell="f" fillcolor="silver" stroked="f">
           <v:fill opacity=".5"/>
           <v:textpath style="font-family:&quot;Yu Gothic UI Semibold&quot;;font-size:80pt" string="UNISA"/>
+          <w10:wrap anchorx="margin" anchory="margin"/>
         </v:shape>
       </w:pict>
     </w:r>
@@ -1596,7 +1492,7 @@
   </w:p>
   <w:p>
     <w:pPr>
-      <w:pStyle w:val="Cabealho"/>
+      <w:pStyle w:val="Header"/>
       <w:ind w:left="-340"/>
       <w:rPr>
         <w:sz w:val="24"/>
@@ -1624,17 +1520,17 @@
   </w:p>
   <w:p>
     <w:pPr>
-      <w:pStyle w:val="Cabealho"/>
+      <w:pStyle w:val="Header"/>
     </w:pPr>
   </w:p>
 </w:hdr>
 </file>
 
 <file path=word/header3.xml><?xml version="1.0" encoding="utf-8"?>
-<w:hdr xmlns:wpc="http://schemas.microsoft.com/office/word/2010/wordprocessingCanvas" xmlns:cx="http://schemas.microsoft.com/office/drawing/2014/chartex" xmlns:cx1="http://schemas.microsoft.com/office/drawing/2015/9/8/chartex" xmlns:cx2="http://schemas.microsoft.com/office/drawing/2015/10/21/chartex" xmlns:cx3="http://schemas.microsoft.com/office/drawing/2016/5/9/chartex" xmlns:cx4="http://schemas.microsoft.com/office/drawing/2016/5/10/chartex" xmlns:cx5="http://schemas.microsoft.com/office/drawing/2016/5/11/chartex" xmlns:cx6="http://schemas.microsoft.com/office/drawing/2016/5/12/chartex" xmlns:cx7="http://schemas.microsoft.com/office/drawing/2016/5/13/chartex" xmlns:cx8="http://schemas.microsoft.com/office/drawing/2016/5/14/chartex" xmlns:mc="http://schemas.openxmlformats.org/markup-compatibility/2006" xmlns:aink="http://schemas.microsoft.com/office/drawing/2016/ink" xmlns:am3d="http://schemas.microsoft.com/office/drawing/2017/model3d" xmlns:o="urn:schemas-microsoft-com:office:office" xmlns:oel="http://schemas.microsoft.com/office/2019/extlst" xmlns:r="http://schemas.openxmlformats.org/officeDocument/2006/relationships" xmlns:m="http://schemas.openxmlformats.org/officeDocument/2006/math" xmlns:v="urn:schemas-microsoft-com:vml" xmlns:wp14="http://schemas.microsoft.com/office/word/2010/wordprocessingDrawing" xmlns:wp="http://schemas.openxmlformats.org/drawingml/2006/wordprocessingDrawing" xmlns:w10="urn:schemas-microsoft-com:office:word" xmlns:w="http://schemas.openxmlformats.org/wordprocessingml/2006/main" xmlns:w14="http://schemas.microsoft.com/office/word/2010/wordml" xmlns:w15="http://schemas.microsoft.com/office/word/2012/wordml" xmlns:w16cex="http://schemas.microsoft.com/office/word/2018/wordml/cex" xmlns:w16cid="http://schemas.microsoft.com/office/word/2016/wordml/cid" xmlns:w16="http://schemas.microsoft.com/office/word/2018/wordml" xmlns:w16sdtdh="http://schemas.microsoft.com/office/word/2020/wordml/sdtdatahash" xmlns:w16se="http://schemas.microsoft.com/office/word/2015/wordml/symex" xmlns:wpg="http://schemas.microsoft.com/office/word/2010/wordprocessingGroup" xmlns:wpi="http://schemas.microsoft.com/office/word/2010/wordprocessingInk" xmlns:wne="http://schemas.microsoft.com/office/word/2006/wordml" xmlns:wps="http://schemas.microsoft.com/office/word/2010/wordprocessingShape" mc:Ignorable="w14 w15 w16se w16cid w16 w16cex w16sdtdh wp14">
+<w:hdr xmlns:wpc="http://schemas.microsoft.com/office/word/2010/wordprocessingCanvas" xmlns:cx="http://schemas.microsoft.com/office/drawing/2014/chartex" xmlns:cx1="http://schemas.microsoft.com/office/drawing/2015/9/8/chartex" xmlns:cx2="http://schemas.microsoft.com/office/drawing/2015/10/21/chartex" xmlns:cx3="http://schemas.microsoft.com/office/drawing/2016/5/9/chartex" xmlns:cx4="http://schemas.microsoft.com/office/drawing/2016/5/10/chartex" xmlns:cx5="http://schemas.microsoft.com/office/drawing/2016/5/11/chartex" xmlns:cx6="http://schemas.microsoft.com/office/drawing/2016/5/12/chartex" xmlns:cx7="http://schemas.microsoft.com/office/drawing/2016/5/13/chartex" xmlns:cx8="http://schemas.microsoft.com/office/drawing/2016/5/14/chartex" xmlns:mc="http://schemas.openxmlformats.org/markup-compatibility/2006" xmlns:aink="http://schemas.microsoft.com/office/drawing/2016/ink" xmlns:am3d="http://schemas.microsoft.com/office/drawing/2017/model3d" xmlns:o="urn:schemas-microsoft-com:office:office" xmlns:oel="http://schemas.microsoft.com/office/2019/extlst" xmlns:r="http://schemas.openxmlformats.org/officeDocument/2006/relationships" xmlns:m="http://schemas.openxmlformats.org/officeDocument/2006/math" xmlns:v="urn:schemas-microsoft-com:vml" xmlns:wp14="http://schemas.microsoft.com/office/word/2010/wordprocessingDrawing" xmlns:wp="http://schemas.openxmlformats.org/drawingml/2006/wordprocessingDrawing" xmlns:w10="urn:schemas-microsoft-com:office:word" xmlns:w="http://schemas.openxmlformats.org/wordprocessingml/2006/main" xmlns:w14="http://schemas.microsoft.com/office/word/2010/wordml" xmlns:w15="http://schemas.microsoft.com/office/word/2012/wordml" xmlns:w16cex="http://schemas.microsoft.com/office/word/2018/wordml/cex" xmlns:w16cid="http://schemas.microsoft.com/office/word/2016/wordml/cid" xmlns:w16="http://schemas.microsoft.com/office/word/2018/wordml" xmlns:w16du="http://schemas.microsoft.com/office/word/2023/wordml/word16du" xmlns:w16sdtdh="http://schemas.microsoft.com/office/word/2020/wordml/sdtdatahash" xmlns:w16sdtfl="http://schemas.microsoft.com/office/word/2024/wordml/sdtformatlock" xmlns:w16se="http://schemas.microsoft.com/office/word/2015/wordml/symex" xmlns:wpg="http://schemas.microsoft.com/office/word/2010/wordprocessingGroup" xmlns:wpi="http://schemas.microsoft.com/office/word/2010/wordprocessingInk" xmlns:wne="http://schemas.microsoft.com/office/word/2006/wordml" xmlns:wps="http://schemas.microsoft.com/office/word/2010/wordprocessingShape" mc:Ignorable="w14 w15 w16se w16cid w16 w16cex w16sdtdh w16sdtfl w16du wp14">
   <w:p>
     <w:pPr>
-      <w:pStyle w:val="Cabealho"/>
+      <w:pStyle w:val="Header"/>
     </w:pPr>
     <w:r>
       <w:rPr>
@@ -1668,6 +1564,7 @@
         <v:shape id="PowerPlusWaterMarkObject61354406" o:spid="_x0000_s1041" type="#_x0000_t136" style="position:absolute;margin-left:0;margin-top:0;width:238.5pt;height:106.5pt;z-index:-251659264;mso-position-horizontal:center;mso-position-horizontal-relative:margin;mso-position-vertical:center;mso-position-vertical-relative:margin" o:allowincell="f" fillcolor="silver" stroked="f">
           <v:fill opacity=".5"/>
           <v:textpath style="font-family:&quot;Yu Gothic UI Semibold&quot;;font-size:80pt" string="UNISA"/>
+          <w10:wrap anchorx="margin" anchory="margin"/>
         </v:shape>
       </w:pict>
     </w:r>
@@ -1676,7 +1573,7 @@
 </file>
 
 <file path=word/numbering.xml><?xml version="1.0" encoding="utf-8"?>
-<w:numbering xmlns:wpc="http://schemas.microsoft.com/office/word/2010/wordprocessingCanvas" xmlns:cx="http://schemas.microsoft.com/office/drawing/2014/chartex" xmlns:cx1="http://schemas.microsoft.com/office/drawing/2015/9/8/chartex" xmlns:cx2="http://schemas.microsoft.com/office/drawing/2015/10/21/chartex" xmlns:cx3="http://schemas.microsoft.com/office/drawing/2016/5/9/chartex" xmlns:cx4="http://schemas.microsoft.com/office/drawing/2016/5/10/chartex" xmlns:cx5="http://schemas.microsoft.com/office/drawing/2016/5/11/chartex" xmlns:cx6="http://schemas.microsoft.com/office/drawing/2016/5/12/chartex" xmlns:cx7="http://schemas.microsoft.com/office/drawing/2016/5/13/chartex" xmlns:cx8="http://schemas.microsoft.com/office/drawing/2016/5/14/chartex" xmlns:mc="http://schemas.openxmlformats.org/markup-compatibility/2006" xmlns:aink="http://schemas.microsoft.com/office/drawing/2016/ink" xmlns:am3d="http://schemas.microsoft.com/office/drawing/2017/model3d" xmlns:o="urn:schemas-microsoft-com:office:office" xmlns:oel="http://schemas.microsoft.com/office/2019/extlst" xmlns:r="http://schemas.openxmlformats.org/officeDocument/2006/relationships" xmlns:m="http://schemas.openxmlformats.org/officeDocument/2006/math" xmlns:v="urn:schemas-microsoft-com:vml" xmlns:wp14="http://schemas.microsoft.com/office/word/2010/wordprocessingDrawing" xmlns:wp="http://schemas.openxmlformats.org/drawingml/2006/wordprocessingDrawing" xmlns:w10="urn:schemas-microsoft-com:office:word" xmlns:w="http://schemas.openxmlformats.org/wordprocessingml/2006/main" xmlns:w14="http://schemas.microsoft.com/office/word/2010/wordml" xmlns:w15="http://schemas.microsoft.com/office/word/2012/wordml" xmlns:w16cex="http://schemas.microsoft.com/office/word/2018/wordml/cex" xmlns:w16cid="http://schemas.microsoft.com/office/word/2016/wordml/cid" xmlns:w16="http://schemas.microsoft.com/office/word/2018/wordml" xmlns:w16sdtdh="http://schemas.microsoft.com/office/word/2020/wordml/sdtdatahash" xmlns:w16se="http://schemas.microsoft.com/office/word/2015/wordml/symex" xmlns:wpg="http://schemas.microsoft.com/office/word/2010/wordprocessingGroup" xmlns:wpi="http://schemas.microsoft.com/office/word/2010/wordprocessingInk" xmlns:wne="http://schemas.microsoft.com/office/word/2006/wordml" xmlns:wps="http://schemas.microsoft.com/office/word/2010/wordprocessingShape" mc:Ignorable="w14 w15 w16se w16cid w16 w16cex w16sdtdh wp14">
+<w:numbering xmlns:wpc="http://schemas.microsoft.com/office/word/2010/wordprocessingCanvas" xmlns:cx="http://schemas.microsoft.com/office/drawing/2014/chartex" xmlns:cx1="http://schemas.microsoft.com/office/drawing/2015/9/8/chartex" xmlns:cx2="http://schemas.microsoft.com/office/drawing/2015/10/21/chartex" xmlns:cx3="http://schemas.microsoft.com/office/drawing/2016/5/9/chartex" xmlns:cx4="http://schemas.microsoft.com/office/drawing/2016/5/10/chartex" xmlns:cx5="http://schemas.microsoft.com/office/drawing/2016/5/11/chartex" xmlns:cx6="http://schemas.microsoft.com/office/drawing/2016/5/12/chartex" xmlns:cx7="http://schemas.microsoft.com/office/drawing/2016/5/13/chartex" xmlns:cx8="http://schemas.microsoft.com/office/drawing/2016/5/14/chartex" xmlns:mc="http://schemas.openxmlformats.org/markup-compatibility/2006" xmlns:aink="http://schemas.microsoft.com/office/drawing/2016/ink" xmlns:am3d="http://schemas.microsoft.com/office/drawing/2017/model3d" xmlns:o="urn:schemas-microsoft-com:office:office" xmlns:oel="http://schemas.microsoft.com/office/2019/extlst" xmlns:r="http://schemas.openxmlformats.org/officeDocument/2006/relationships" xmlns:m="http://schemas.openxmlformats.org/officeDocument/2006/math" xmlns:v="urn:schemas-microsoft-com:vml" xmlns:wp14="http://schemas.microsoft.com/office/word/2010/wordprocessingDrawing" xmlns:wp="http://schemas.openxmlformats.org/drawingml/2006/wordprocessingDrawing" xmlns:w10="urn:schemas-microsoft-com:office:word" xmlns:w="http://schemas.openxmlformats.org/wordprocessingml/2006/main" xmlns:w14="http://schemas.microsoft.com/office/word/2010/wordml" xmlns:w15="http://schemas.microsoft.com/office/word/2012/wordml" xmlns:w16cex="http://schemas.microsoft.com/office/word/2018/wordml/cex" xmlns:w16cid="http://schemas.microsoft.com/office/word/2016/wordml/cid" xmlns:w16="http://schemas.microsoft.com/office/word/2018/wordml" xmlns:w16du="http://schemas.microsoft.com/office/word/2023/wordml/word16du" xmlns:w16sdtdh="http://schemas.microsoft.com/office/word/2020/wordml/sdtdatahash" xmlns:w16sdtfl="http://schemas.microsoft.com/office/word/2024/wordml/sdtformatlock" xmlns:w16se="http://schemas.microsoft.com/office/word/2015/wordml/symex" xmlns:wpg="http://schemas.microsoft.com/office/word/2010/wordprocessingGroup" xmlns:wpi="http://schemas.microsoft.com/office/word/2010/wordprocessingInk" xmlns:wne="http://schemas.microsoft.com/office/word/2006/wordml" xmlns:wps="http://schemas.microsoft.com/office/word/2010/wordprocessingShape" mc:Ignorable="w14 w15 w16se w16cid w16 w16cex w16sdtdh w16sdtfl w16du wp14">
   <w:abstractNum w:abstractNumId="0" w15:restartNumberingAfterBreak="0">
     <w:nsid w:val="097A3CED"/>
     <w:multiLevelType w:val="hybridMultilevel"/>
@@ -1846,7 +1743,7 @@
 </file>
 
 <file path=word/styles.xml><?xml version="1.0" encoding="utf-8"?>
-<w:styles xmlns:mc="http://schemas.openxmlformats.org/markup-compatibility/2006" xmlns:r="http://schemas.openxmlformats.org/officeDocument/2006/relationships" xmlns:w="http://schemas.openxmlformats.org/wordprocessingml/2006/main" xmlns:w14="http://schemas.microsoft.com/office/word/2010/wordml" xmlns:w15="http://schemas.microsoft.com/office/word/2012/wordml" xmlns:w16cex="http://schemas.microsoft.com/office/word/2018/wordml/cex" xmlns:w16cid="http://schemas.microsoft.com/office/word/2016/wordml/cid" xmlns:w16="http://schemas.microsoft.com/office/word/2018/wordml" xmlns:w16sdtdh="http://schemas.microsoft.com/office/word/2020/wordml/sdtdatahash" xmlns:w16se="http://schemas.microsoft.com/office/word/2015/wordml/symex" mc:Ignorable="w14 w15 w16se w16cid w16 w16cex w16sdtdh">
+<w:styles xmlns:mc="http://schemas.openxmlformats.org/markup-compatibility/2006" xmlns:r="http://schemas.openxmlformats.org/officeDocument/2006/relationships" xmlns:w="http://schemas.openxmlformats.org/wordprocessingml/2006/main" xmlns:w14="http://schemas.microsoft.com/office/word/2010/wordml" xmlns:w15="http://schemas.microsoft.com/office/word/2012/wordml" xmlns:w16cex="http://schemas.microsoft.com/office/word/2018/wordml/cex" xmlns:w16cid="http://schemas.microsoft.com/office/word/2016/wordml/cid" xmlns:w16="http://schemas.microsoft.com/office/word/2018/wordml" xmlns:w16du="http://schemas.microsoft.com/office/word/2023/wordml/word16du" xmlns:w16sdtdh="http://schemas.microsoft.com/office/word/2020/wordml/sdtdatahash" xmlns:w16sdtfl="http://schemas.microsoft.com/office/word/2024/wordml/sdtformatlock" xmlns:w16se="http://schemas.microsoft.com/office/word/2015/wordml/symex" mc:Ignorable="w14 w15 w16se w16cid w16 w16cex w16sdtdh w16sdtfl w16du">
   <w:docDefaults>
     <w:rPrDefault>
       <w:rPr>
@@ -1872,6 +1769,50 @@
     <w:lsdException w:name="Subtitle" w:qFormat="1"/>
     <w:lsdException w:name="Strong" w:qFormat="1"/>
     <w:lsdException w:name="Emphasis" w:qFormat="1"/>
+    <w:lsdException w:name="Normal Table" w:semiHidden="1" w:unhideWhenUsed="1"/>
+    <w:lsdException w:name="Table Simple 1" w:semiHidden="1" w:unhideWhenUsed="1"/>
+    <w:lsdException w:name="Table Simple 2" w:semiHidden="1" w:unhideWhenUsed="1"/>
+    <w:lsdException w:name="Table Simple 3" w:semiHidden="1" w:unhideWhenUsed="1"/>
+    <w:lsdException w:name="Table Classic 1" w:semiHidden="1" w:unhideWhenUsed="1"/>
+    <w:lsdException w:name="Table Classic 2" w:semiHidden="1" w:unhideWhenUsed="1"/>
+    <w:lsdException w:name="Table Classic 3" w:semiHidden="1" w:unhideWhenUsed="1"/>
+    <w:lsdException w:name="Table Classic 4" w:semiHidden="1" w:unhideWhenUsed="1"/>
+    <w:lsdException w:name="Table Colorful 1" w:semiHidden="1" w:unhideWhenUsed="1"/>
+    <w:lsdException w:name="Table Colorful 2" w:semiHidden="1" w:unhideWhenUsed="1"/>
+    <w:lsdException w:name="Table Colorful 3" w:semiHidden="1" w:unhideWhenUsed="1"/>
+    <w:lsdException w:name="Table Columns 1" w:semiHidden="1" w:unhideWhenUsed="1"/>
+    <w:lsdException w:name="Table Columns 2" w:semiHidden="1" w:unhideWhenUsed="1"/>
+    <w:lsdException w:name="Table Columns 3" w:semiHidden="1" w:unhideWhenUsed="1"/>
+    <w:lsdException w:name="Table Columns 4" w:semiHidden="1" w:unhideWhenUsed="1"/>
+    <w:lsdException w:name="Table Columns 5" w:semiHidden="1" w:unhideWhenUsed="1"/>
+    <w:lsdException w:name="Table Grid 1" w:semiHidden="1" w:unhideWhenUsed="1"/>
+    <w:lsdException w:name="Table Grid 2" w:semiHidden="1" w:unhideWhenUsed="1"/>
+    <w:lsdException w:name="Table Grid 3" w:semiHidden="1" w:unhideWhenUsed="1"/>
+    <w:lsdException w:name="Table Grid 4" w:semiHidden="1" w:unhideWhenUsed="1"/>
+    <w:lsdException w:name="Table Grid 5" w:semiHidden="1" w:unhideWhenUsed="1"/>
+    <w:lsdException w:name="Table Grid 6" w:semiHidden="1" w:unhideWhenUsed="1"/>
+    <w:lsdException w:name="Table Grid 7" w:semiHidden="1" w:unhideWhenUsed="1"/>
+    <w:lsdException w:name="Table Grid 8" w:semiHidden="1" w:unhideWhenUsed="1"/>
+    <w:lsdException w:name="Table List 1" w:semiHidden="1" w:unhideWhenUsed="1"/>
+    <w:lsdException w:name="Table List 2" w:semiHidden="1" w:unhideWhenUsed="1"/>
+    <w:lsdException w:name="Table List 3" w:semiHidden="1" w:unhideWhenUsed="1"/>
+    <w:lsdException w:name="Table List 4" w:semiHidden="1" w:unhideWhenUsed="1"/>
+    <w:lsdException w:name="Table List 5" w:semiHidden="1" w:unhideWhenUsed="1"/>
+    <w:lsdException w:name="Table List 6" w:semiHidden="1" w:unhideWhenUsed="1"/>
+    <w:lsdException w:name="Table List 7" w:semiHidden="1" w:unhideWhenUsed="1"/>
+    <w:lsdException w:name="Table List 8" w:semiHidden="1" w:unhideWhenUsed="1"/>
+    <w:lsdException w:name="Table 3D effects 1" w:semiHidden="1" w:unhideWhenUsed="1"/>
+    <w:lsdException w:name="Table 3D effects 2" w:semiHidden="1" w:unhideWhenUsed="1"/>
+    <w:lsdException w:name="Table 3D effects 3" w:semiHidden="1" w:unhideWhenUsed="1"/>
+    <w:lsdException w:name="Table Contemporary" w:semiHidden="1" w:unhideWhenUsed="1"/>
+    <w:lsdException w:name="Table Elegant" w:semiHidden="1" w:unhideWhenUsed="1"/>
+    <w:lsdException w:name="Table Professional" w:semiHidden="1" w:unhideWhenUsed="1"/>
+    <w:lsdException w:name="Table Subtle 1" w:semiHidden="1" w:unhideWhenUsed="1"/>
+    <w:lsdException w:name="Table Subtle 2" w:semiHidden="1" w:unhideWhenUsed="1"/>
+    <w:lsdException w:name="Table Web 1" w:semiHidden="1" w:unhideWhenUsed="1"/>
+    <w:lsdException w:name="Table Web 2" w:semiHidden="1" w:unhideWhenUsed="1"/>
+    <w:lsdException w:name="Table Web 3" w:semiHidden="1" w:unhideWhenUsed="1"/>
+    <w:lsdException w:name="Table Theme" w:semiHidden="1" w:unhideWhenUsed="1"/>
     <w:lsdException w:name="Placeholder Text" w:semiHidden="1" w:uiPriority="99"/>
     <w:lsdException w:name="No Spacing" w:uiPriority="1" w:qFormat="1"/>
     <w:lsdException w:name="Light Shading" w:uiPriority="60"/>
@@ -2097,7 +2038,7 @@
     <w:name w:val="Normal"/>
     <w:qFormat/>
   </w:style>
-  <w:style w:type="paragraph" w:styleId="Ttulo1">
+  <w:style w:type="paragraph" w:styleId="Heading1">
     <w:name w:val="heading 1"/>
     <w:basedOn w:val="Normal"/>
     <w:next w:val="Normal"/>
@@ -2112,7 +2053,7 @@
       <w:sz w:val="32"/>
     </w:rPr>
   </w:style>
-  <w:style w:type="paragraph" w:styleId="Ttulo2">
+  <w:style w:type="paragraph" w:styleId="Heading2">
     <w:name w:val="heading 2"/>
     <w:basedOn w:val="Normal"/>
     <w:next w:val="Normal"/>
@@ -2125,7 +2066,7 @@
       <w:sz w:val="28"/>
     </w:rPr>
   </w:style>
-  <w:style w:type="paragraph" w:styleId="Ttulo3">
+  <w:style w:type="paragraph" w:styleId="Heading3">
     <w:name w:val="heading 3"/>
     <w:basedOn w:val="Normal"/>
     <w:next w:val="Normal"/>
@@ -2141,7 +2082,7 @@
       <w:u w:val="single"/>
     </w:rPr>
   </w:style>
-  <w:style w:type="paragraph" w:styleId="Ttulo4">
+  <w:style w:type="paragraph" w:styleId="Heading4">
     <w:name w:val="heading 4"/>
     <w:basedOn w:val="Normal"/>
     <w:next w:val="Normal"/>
@@ -2154,7 +2095,7 @@
       <w:b/>
     </w:rPr>
   </w:style>
-  <w:style w:type="paragraph" w:styleId="Ttulo5">
+  <w:style w:type="paragraph" w:styleId="Heading5">
     <w:name w:val="heading 5"/>
     <w:basedOn w:val="Normal"/>
     <w:next w:val="Normal"/>
@@ -2205,7 +2146,7 @@
       <w:sz w:val="28"/>
     </w:rPr>
   </w:style>
-  <w:style w:type="paragraph" w:styleId="Ttulo6">
+  <w:style w:type="paragraph" w:styleId="Heading6">
     <w:name w:val="heading 6"/>
     <w:basedOn w:val="Normal"/>
     <w:next w:val="Normal"/>
@@ -2256,13 +2197,17 @@
       <w:sz w:val="24"/>
     </w:rPr>
   </w:style>
-  <w:style w:type="character" w:default="1" w:styleId="Fontepargpadro">
+  <w:style w:type="character" w:default="1" w:styleId="DefaultParagraphFont">
     <w:name w:val="Default Paragraph Font"/>
+    <w:uiPriority w:val="1"/>
     <w:semiHidden/>
+    <w:unhideWhenUsed/>
   </w:style>
-  <w:style w:type="table" w:default="1" w:styleId="Tabelanormal">
+  <w:style w:type="table" w:default="1" w:styleId="TableNormal">
     <w:name w:val="Normal Table"/>
+    <w:uiPriority w:val="99"/>
     <w:semiHidden/>
+    <w:unhideWhenUsed/>
     <w:tblPr>
       <w:tblInd w:w="0" w:type="dxa"/>
       <w:tblCellMar>
@@ -2273,11 +2218,13 @@
       </w:tblCellMar>
     </w:tblPr>
   </w:style>
-  <w:style w:type="numbering" w:default="1" w:styleId="Semlista">
+  <w:style w:type="numbering" w:default="1" w:styleId="NoList">
     <w:name w:val="No List"/>
+    <w:uiPriority w:val="99"/>
     <w:semiHidden/>
+    <w:unhideWhenUsed/>
   </w:style>
-  <w:style w:type="paragraph" w:styleId="Corpodetexto">
+  <w:style w:type="paragraph" w:styleId="BodyText">
     <w:name w:val="Body Text"/>
     <w:basedOn w:val="Normal"/>
     <w:pPr>
@@ -2288,7 +2235,7 @@
       <w:sz w:val="32"/>
     </w:rPr>
   </w:style>
-  <w:style w:type="paragraph" w:styleId="Corpodetexto2">
+  <w:style w:type="paragraph" w:styleId="BodyText2">
     <w:name w:val="Body Text 2"/>
     <w:basedOn w:val="Normal"/>
     <w:pPr>
@@ -2298,7 +2245,7 @@
       <w:sz w:val="32"/>
     </w:rPr>
   </w:style>
-  <w:style w:type="paragraph" w:styleId="Cabealho">
+  <w:style w:type="paragraph" w:styleId="Header">
     <w:name w:val="header"/>
     <w:basedOn w:val="Normal"/>
     <w:pPr>
@@ -2308,7 +2255,7 @@
       </w:tabs>
     </w:pPr>
   </w:style>
-  <w:style w:type="paragraph" w:styleId="Rodap">
+  <w:style w:type="paragraph" w:styleId="Footer">
     <w:name w:val="footer"/>
     <w:basedOn w:val="Normal"/>
     <w:pPr>
@@ -2318,7 +2265,7 @@
       </w:tabs>
     </w:pPr>
   </w:style>
-  <w:style w:type="paragraph" w:styleId="Corpodetexto3">
+  <w:style w:type="paragraph" w:styleId="BodyText3">
     <w:name w:val="Body Text 3"/>
     <w:basedOn w:val="Normal"/>
     <w:pPr>
@@ -2365,10 +2312,10 @@
       <w:rFonts w:ascii="Courier New" w:hAnsi="Courier New"/>
     </w:rPr>
   </w:style>
-  <w:style w:type="paragraph" w:styleId="Textodebalo">
+  <w:style w:type="paragraph" w:styleId="BalloonText">
     <w:name w:val="Balloon Text"/>
     <w:basedOn w:val="Normal"/>
-    <w:link w:val="TextodebaloChar"/>
+    <w:link w:val="BalloonTextChar"/>
     <w:rsid w:val="00997D47"/>
     <w:rPr>
       <w:rFonts w:ascii="Segoe UI" w:hAnsi="Segoe UI" w:cs="Segoe UI"/>
@@ -2376,9 +2323,9 @@
       <w:szCs w:val="18"/>
     </w:rPr>
   </w:style>
-  <w:style w:type="character" w:customStyle="1" w:styleId="TextodebaloChar">
-    <w:name w:val="Texto de balão Char"/>
-    <w:link w:val="Textodebalo"/>
+  <w:style w:type="character" w:customStyle="1" w:styleId="BalloonTextChar">
+    <w:name w:val="Balloon Text Char"/>
+    <w:link w:val="BalloonText"/>
     <w:rsid w:val="00997D47"/>
     <w:rPr>
       <w:rFonts w:ascii="Segoe UI" w:hAnsi="Segoe UI" w:cs="Segoe UI"/>

</xml_diff>